<commit_message>
Close the report with every placeholder filled
보고서 최종본입니다. [진행 중] 자리 다섯 곳이 전부 실제 수치로
채워졌습니다 -- 수분 경쟁 v3, 재생 에너지 v3, 민감도 시험, 조성 격자,
그리고 마지막으로 혼합 조성의 습윤 작업 용량.

11절이 이 보고서의 결말입니다. sa50nb50 이 두 문턱을 동시에 넘은 첫
조성이라는 것과, 그럼에도 습윤 작업 용량에서 최적 조성에 4.69시그마로
진다는 것을 나란히 실었습니다. 관문을 통과했다고 성능이 앞서는 것이
아니라는 것 -- 이 프로젝트가 처음부터 말해 온 것이 마지막 절에서 한 번
더 확인된 셈입니다.

원인도 적었습니다. 니트로기는 공동을 넓혀 구조를 살렸지만 그만큼 CO2 를
덜 붙잡습니다. 구조 여유를 산 대가이고, 건조 로딩에서 이미 보이던
차이가 습윤까지 이어졌습니다. 반면 물 부담을 줄인다는 설계 원리 자체는
확인됐습니다(물/CO2 0.72~0.73, 물 제거율 86~90%).

향후 과제 첫 줄을 "혼합 설계에서 공동을 넓히지 않고 흡착을 유지하는
경로" 로 바꿨습니다. 이번 결과가 다음 질문을 그렇게 좁혔습니다.

추정 8.5페이지, 표 10개.
</commit_message>
<xml_diff>
--- a/04_Analysis/MTV_ZIF69_보고서.docx
+++ b/04_Analysis/MTV_ZIF69_보고서.docx
@@ -6961,7 +6961,7 @@
           <w:i w:val="0"/>
           <w:sz w:val="19"/>
         </w:rPr>
-        <w:t>표 10. 혼합 치환 조성의 건조 성능과 구조 안정성</w:t>
+        <w:t>표 10. 혼합 치환 조성 — 건조 성능, 구조 안정성, 습윤 작업 용량</w:t>
       </w:r>
     </w:p>
     <w:tbl>
@@ -7023,7 +7023,7 @@
         </w:tc>
         <w:tc>
           <w:tcPr>
-            <w:tcW w:type="dxa" w:w="1644"/>
+            <w:tcW w:type="dxa" w:w="1474"/>
           </w:tcPr>
           <w:p>
             <w:pPr>
@@ -7038,28 +7038,7 @@
                 <w:i w:val="0"/>
                 <w:sz w:val="19"/>
               </w:rPr>
-              <w:t>Q_st (kJ/mol)</w:t>
-            </w:r>
-          </w:p>
-        </w:tc>
-        <w:tc>
-          <w:tcPr>
-            <w:tcW w:type="dxa" w:w="1701"/>
-          </w:tcPr>
-          <w:p>
-            <w:pPr>
-              <w:spacing w:after="20" w:before="20" w:line="240" w:lineRule="auto"/>
-              <w:jc w:val="center"/>
-            </w:pPr>
-            <w:r/>
-            <w:r>
-              <w:rPr>
-                <w:rFonts w:ascii="Times New Roman" w:hAnsi="Times New Roman" w:eastAsia="맑은 고딕"/>
-                <w:b/>
-                <w:i w:val="0"/>
-                <w:sz w:val="19"/>
-              </w:rPr>
-              <w:t>0.15 bar 로딩</w:t>
+              <w:t>Q_st</w:t>
             </w:r>
           </w:p>
         </w:tc>
@@ -7086,7 +7065,7 @@
         </w:tc>
         <w:tc>
           <w:tcPr>
-            <w:tcW w:type="dxa" w:w="1304"/>
+            <w:tcW w:type="dxa" w:w="1701"/>
           </w:tcPr>
           <w:p>
             <w:pPr>
@@ -7101,7 +7080,28 @@
                 <w:i w:val="0"/>
                 <w:sz w:val="19"/>
               </w:rPr>
-              <w:t>두 문턱</w:t>
+              <w:t>습윤 TSA WC</w:t>
+            </w:r>
+          </w:p>
+        </w:tc>
+        <w:tc>
+          <w:tcPr>
+            <w:tcW w:type="dxa" w:w="1020"/>
+          </w:tcPr>
+          <w:p>
+            <w:pPr>
+              <w:spacing w:after="20" w:before="20" w:line="240" w:lineRule="auto"/>
+              <w:jc w:val="center"/>
+            </w:pPr>
+            <w:r/>
+            <w:r>
+              <w:rPr>
+                <w:rFonts w:ascii="Times New Roman" w:hAnsi="Times New Roman" w:eastAsia="맑은 고딕"/>
+                <w:b/>
+                <w:i w:val="0"/>
+                <w:sz w:val="19"/>
+              </w:rPr>
+              <w:t>물/CO₂</w:t>
             </w:r>
           </w:p>
         </w:tc>
@@ -7150,7 +7150,7 @@
         </w:tc>
         <w:tc>
           <w:tcPr>
-            <w:tcW w:type="dxa" w:w="1644"/>
+            <w:tcW w:type="dxa" w:w="1474"/>
           </w:tcPr>
           <w:p>
             <w:pPr>
@@ -7166,27 +7166,6 @@
                 <w:sz w:val="19"/>
               </w:rPr>
               <w:t>30.36 ± 0.35</w:t>
-            </w:r>
-          </w:p>
-        </w:tc>
-        <w:tc>
-          <w:tcPr>
-            <w:tcW w:type="dxa" w:w="1701"/>
-          </w:tcPr>
-          <w:p>
-            <w:pPr>
-              <w:spacing w:after="20" w:before="20" w:line="240" w:lineRule="auto"/>
-              <w:jc w:val="center"/>
-            </w:pPr>
-            <w:r/>
-            <w:r>
-              <w:rPr>
-                <w:rFonts w:ascii="Times New Roman" w:hAnsi="Times New Roman" w:eastAsia="맑은 고딕"/>
-                <w:b w:val="0"/>
-                <w:i w:val="0"/>
-                <w:sz w:val="19"/>
-              </w:rPr>
-              <w:t>1.1163 ± 0.0184</w:t>
             </w:r>
           </w:p>
         </w:tc>
@@ -7213,7 +7192,7 @@
         </w:tc>
         <w:tc>
           <w:tcPr>
-            <w:tcW w:type="dxa" w:w="1304"/>
+            <w:tcW w:type="dxa" w:w="1701"/>
           </w:tcPr>
           <w:p>
             <w:pPr>
@@ -7228,7 +7207,28 @@
                 <w:i w:val="0"/>
                 <w:sz w:val="19"/>
               </w:rPr>
-              <w:t>동시 통과</w:t>
+              <w:t>0.6930 ± 0.0159</w:t>
+            </w:r>
+          </w:p>
+        </w:tc>
+        <w:tc>
+          <w:tcPr>
+            <w:tcW w:type="dxa" w:w="1020"/>
+          </w:tcPr>
+          <w:p>
+            <w:pPr>
+              <w:spacing w:after="20" w:before="20" w:line="240" w:lineRule="auto"/>
+              <w:jc w:val="center"/>
+            </w:pPr>
+            <w:r/>
+            <w:r>
+              <w:rPr>
+                <w:rFonts w:ascii="Times New Roman" w:hAnsi="Times New Roman" w:eastAsia="맑은 고딕"/>
+                <w:b w:val="0"/>
+                <w:i w:val="0"/>
+                <w:sz w:val="19"/>
+              </w:rPr>
+              <w:t>1.30</w:t>
             </w:r>
           </w:p>
         </w:tc>
@@ -7277,7 +7277,7 @@
         </w:tc>
         <w:tc>
           <w:tcPr>
-            <w:tcW w:type="dxa" w:w="1644"/>
+            <w:tcW w:type="dxa" w:w="1474"/>
           </w:tcPr>
           <w:p>
             <w:pPr>
@@ -7293,27 +7293,6 @@
                 <w:sz w:val="19"/>
               </w:rPr>
               <w:t>29.58 ± 0.34</w:t>
-            </w:r>
-          </w:p>
-        </w:tc>
-        <w:tc>
-          <w:tcPr>
-            <w:tcW w:type="dxa" w:w="1701"/>
-          </w:tcPr>
-          <w:p>
-            <w:pPr>
-              <w:spacing w:after="20" w:before="20" w:line="240" w:lineRule="auto"/>
-              <w:jc w:val="center"/>
-            </w:pPr>
-            <w:r/>
-            <w:r>
-              <w:rPr>
-                <w:rFonts w:ascii="Times New Roman" w:hAnsi="Times New Roman" w:eastAsia="맑은 고딕"/>
-                <w:b w:val="0"/>
-                <w:i w:val="0"/>
-                <w:sz w:val="19"/>
-              </w:rPr>
-              <w:t>0.8846 ± 0.0207</w:t>
             </w:r>
           </w:p>
         </w:tc>
@@ -7340,7 +7319,7 @@
         </w:tc>
         <w:tc>
           <w:tcPr>
-            <w:tcW w:type="dxa" w:w="1304"/>
+            <w:tcW w:type="dxa" w:w="1701"/>
           </w:tcPr>
           <w:p>
             <w:pPr>
@@ -7355,7 +7334,28 @@
                 <w:i w:val="0"/>
                 <w:sz w:val="19"/>
               </w:rPr>
-              <w:t>안정성만</w:t>
+              <w:t>0.5999 ± 0.0160</w:t>
+            </w:r>
+          </w:p>
+        </w:tc>
+        <w:tc>
+          <w:tcPr>
+            <w:tcW w:type="dxa" w:w="1020"/>
+          </w:tcPr>
+          <w:p>
+            <w:pPr>
+              <w:spacing w:after="20" w:before="20" w:line="240" w:lineRule="auto"/>
+              <w:jc w:val="center"/>
+            </w:pPr>
+            <w:r/>
+            <w:r>
+              <w:rPr>
+                <w:rFonts w:ascii="Times New Roman" w:hAnsi="Times New Roman" w:eastAsia="맑은 고딕"/>
+                <w:b w:val="0"/>
+                <w:i w:val="0"/>
+                <w:sz w:val="19"/>
+              </w:rPr>
+              <w:t>0.72</w:t>
             </w:r>
           </w:p>
         </w:tc>
@@ -7404,7 +7404,7 @@
         </w:tc>
         <w:tc>
           <w:tcPr>
-            <w:tcW w:type="dxa" w:w="1644"/>
+            <w:tcW w:type="dxa" w:w="1474"/>
           </w:tcPr>
           <w:p>
             <w:pPr>
@@ -7420,27 +7420,6 @@
                 <w:sz w:val="19"/>
               </w:rPr>
               <w:t>28.45 ± 0.19</w:t>
-            </w:r>
-          </w:p>
-        </w:tc>
-        <w:tc>
-          <w:tcPr>
-            <w:tcW w:type="dxa" w:w="1701"/>
-          </w:tcPr>
-          <w:p>
-            <w:pPr>
-              <w:spacing w:after="20" w:before="20" w:line="240" w:lineRule="auto"/>
-              <w:jc w:val="center"/>
-            </w:pPr>
-            <w:r/>
-            <w:r>
-              <w:rPr>
-                <w:rFonts w:ascii="Times New Roman" w:hAnsi="Times New Roman" w:eastAsia="맑은 고딕"/>
-                <w:b w:val="0"/>
-                <w:i w:val="0"/>
-                <w:sz w:val="19"/>
-              </w:rPr>
-              <w:t>0.8113 ± 0.0253</w:t>
             </w:r>
           </w:p>
         </w:tc>
@@ -7467,7 +7446,7 @@
         </w:tc>
         <w:tc>
           <w:tcPr>
-            <w:tcW w:type="dxa" w:w="1304"/>
+            <w:tcW w:type="dxa" w:w="1701"/>
           </w:tcPr>
           <w:p>
             <w:pPr>
@@ -7482,7 +7461,28 @@
                 <w:i w:val="0"/>
                 <w:sz w:val="19"/>
               </w:rPr>
-              <w:t>안정성만</w:t>
+              <w:t>0.6257 ± 0.0092</w:t>
+            </w:r>
+          </w:p>
+        </w:tc>
+        <w:tc>
+          <w:tcPr>
+            <w:tcW w:type="dxa" w:w="1020"/>
+          </w:tcPr>
+          <w:p>
+            <w:pPr>
+              <w:spacing w:after="20" w:before="20" w:line="240" w:lineRule="auto"/>
+              <w:jc w:val="center"/>
+            </w:pPr>
+            <w:r/>
+            <w:r>
+              <w:rPr>
+                <w:rFonts w:ascii="Times New Roman" w:hAnsi="Times New Roman" w:eastAsia="맑은 고딕"/>
+                <w:b w:val="0"/>
+                <w:i w:val="0"/>
+                <w:sz w:val="19"/>
+              </w:rPr>
+              <w:t>0.73</w:t>
             </w:r>
           </w:p>
         </w:tc>
@@ -7528,17 +7528,68 @@
     </w:p>
     <w:p>
       <w:pPr>
-        <w:spacing w:line="240" w:lineRule="auto" w:after="120" w:before="0"/>
-        <w:ind w:left="227"/>
+        <w:spacing w:line="240" w:lineRule="auto" w:after="120"/>
+        <w:jc w:val="both"/>
       </w:pPr>
       <w:r>
         <w:rPr>
           <w:rFonts w:ascii="Times New Roman" w:hAnsi="Times New Roman" w:eastAsia="맑은 고딕"/>
           <w:b w:val="0"/>
           <w:i w:val="0"/>
-          <w:sz w:val="19"/>
+          <w:sz w:val="22"/>
         </w:rPr>
-        <w:t>[진행 중] 혼합 조성의 습윤 작업 용량을 측정하고 있다. 술폰산 단독 계열에서는 건조 성능의 우위가 습윤 조건에서 뒤집힌 전례가 있으므로, 이 설계의 최종 판정은 습윤 결과에 달려 있다. 세 조성의 공여성 수소 밀도가 각각 saIm050·saIm025와 같으므로 유지율은 76~80% 구간으로 예상되나 확인이 필요하다.</w:t>
+        <w:t xml:space="preserve">그러나 습윤 조건에서는 이 우위가 유지되지 않는다. sa50nb50의 습윤 작업 용량은 0.6930 ± 0.0159로, 10절의 최적 조성(0.8328 ± 0.0252)보다 </w:t>
+      </w:r>
+      <w:r>
+        <w:rPr>
+          <w:rFonts w:ascii="Times New Roman" w:hAnsi="Times New Roman" w:eastAsia="맑은 고딕"/>
+          <w:b/>
+          <w:i w:val="0"/>
+          <w:sz w:val="22"/>
+        </w:rPr>
+        <w:t>4.69σ 낮다</w:t>
+      </w:r>
+      <w:r>
+        <w:rPr>
+          <w:rFonts w:ascii="Times New Roman" w:hAnsi="Times New Roman" w:eastAsia="맑은 고딕"/>
+          <w:b w:val="0"/>
+          <w:i w:val="0"/>
+          <w:sz w:val="22"/>
+        </w:rPr>
+        <w:t>. 원인은 흡착 쪽에 있다 — 습윤 흡착량이 0.8530인 데 비해 최적 조성은 1.0093이다. 니트로기는 공동을 넓혀 구조를 살렸지만 그만큼 CO₂를 덜 붙잡으며, 건조 로딩에서 이미 나타난 차이(1.1163 대 1.3247)가 습윤에서도 유지된 것이다. 구조 여유를 산 대가로 볼 수 있다.</w:t>
+      </w:r>
+    </w:p>
+    <w:p>
+      <w:pPr>
+        <w:spacing w:line="240" w:lineRule="auto" w:after="120"/>
+        <w:jc w:val="both"/>
+      </w:pPr>
+      <w:r>
+        <w:rPr>
+          <w:rFonts w:ascii="Times New Roman" w:hAnsi="Times New Roman" w:eastAsia="맑은 고딕"/>
+          <w:b w:val="0"/>
+          <w:i w:val="0"/>
+          <w:sz w:val="22"/>
+        </w:rPr>
+        <w:t xml:space="preserve">물 거동은 설계 의도대로였다. 공여성 수소를 줄인 두 조성의 물/CO₂ 몰비는 0.72와 0.73으로 같은 술폰산 밀도의 단독 치환 조성(1.01)보다 낮고, 승온 재생에서 물의 86~90%가 제거되어 자가건조가 정상 작동한다. 즉 </w:t>
+      </w:r>
+      <w:r>
+        <w:rPr>
+          <w:rFonts w:ascii="Times New Roman" w:hAnsi="Times New Roman" w:eastAsia="맑은 고딕"/>
+          <w:b/>
+          <w:i w:val="0"/>
+          <w:sz w:val="22"/>
+        </w:rPr>
+        <w:t>공여성 수소를 줄이면 물 부담이 준다는 설계 원리는 확인되었으나, 그것만으로 작업 용량이 따라오지는 않는다</w:t>
+      </w:r>
+      <w:r>
+        <w:rPr>
+          <w:rFonts w:ascii="Times New Roman" w:hAnsi="Times New Roman" w:eastAsia="맑은 고딕"/>
+          <w:b w:val="0"/>
+          <w:i w:val="0"/>
+          <w:sz w:val="22"/>
+        </w:rPr>
+        <w:t>.</w:t>
       </w:r>
     </w:p>
     <w:p>
@@ -7627,7 +7678,7 @@
           <w:i w:val="0"/>
           <w:sz w:val="21"/>
         </w:rPr>
-        <w:t>· 술폰산과 니트로기를 혼합하면 두 창이 겹친다 — 흡착열 30.36에 공동 감소 9.74%.</w:t>
+        <w:t>· 술폰산과 니트로기를 혼합하면 두 창이 겹친다(흡착열 30.36, 공동 감소 9.74%). 다만 습윤 작업 용량은 최적 조성보다 4.69σ 낮아, 두 문턱 통과가 곧 성능 우위는 아니다.</w:t>
       </w:r>
     </w:p>
     <w:p>
@@ -7686,7 +7737,7 @@
           <w:i w:val="0"/>
           <w:sz w:val="21"/>
         </w:rPr>
-        <w:t>· 혼합 조성의 습윤 작업 용량 확정 — 이 설계의 최종 판정</w:t>
+        <w:t>· 혼합 설계에서 공동을 넓히지 않고 흡착을 유지하는 경로 — 니트로기 대신 더 작은 극성기 검토</w:t>
       </w:r>
     </w:p>
     <w:p>

</xml_diff>

<commit_message>
Give the report a ruler it did not have this morning
ZIF-93 문헌 앵커가 완주해 보고서 4.1 절로 들어갔습니다.

    Q_st CO2   30.25 +- 0.41   문헌 29.3    편차 +0.95
    Q_st N2    15.86 +- 0.08   문헌 15.71   편차 +0.15

사전 등록 판정선(3 kJ/mol)을 통과했습니다. gme 계열은 원논문에 흡착열
실측이 없어 오늘 아침까지 우리 사다리 전체가 교정 기준 없이 떠 있었는데,
이제 자가 붙었습니다.

우리에게 불리한 방향도 그대로 적었습니다. 편차가 양수이므로 우리
흡착열은 약 1 kJ/mol 과대평가되는 쪽이고, 그렇다면 목표대 문턱 부근의
조성(sa50nb50 30.36, saIm075 31.42)은 실제로 문턱에 더 가깝거나 아래일
수 있습니다. 문헌값이 우리 통계오차 밖(2.3시그마)이라는 것과, 두 값의
정의가 다르다는 것(가변온도 피팅 vs 무한희석)도 명시했습니다.

검증 범위도 그었습니다 -- 이 대조가 검증한 것은 흡착열 절대값이고
선택도는 아닙니다. 정의가 다른 값을 비교하면 세 배 차이가 성능 차로
읽힙니다.

부수 결과 하나: 같은 조건(0.15 bar)에서 ZIF-93 로딩이 0.4238 로 우리
무치환 모체(0.5889)보다 낮습니다. 문헌의 1 bar 수치와 비교할 때 분압이
6.7배 다르다는 것을 잊지 않게 각주로 남겼습니다.

추정 9.0 페이지, 표 11 개.
</commit_message>
<xml_diff>
--- a/04_Analysis/MTV_ZIF69_보고서.docx
+++ b/04_Analysis/MTV_ZIF69_보고서.docx
@@ -1222,6 +1222,371 @@
     </w:p>
     <w:p>
       <w:pPr>
+        <w:spacing w:line="240" w:lineRule="auto" w:after="80" w:before="140"/>
+      </w:pPr>
+      <w:r>
+        <w:rPr>
+          <w:rFonts w:ascii="Times New Roman" w:hAnsi="Times New Roman" w:eastAsia="맑은 고딕"/>
+          <w:b/>
+          <w:i w:val="0"/>
+          <w:sz w:val="23"/>
+        </w:rPr>
+        <w:t>4.1 절대값 검증 — 문헌 실측치와의 대조</w:t>
+      </w:r>
+    </w:p>
+    <w:p>
+      <w:pPr>
+        <w:spacing w:line="240" w:lineRule="auto" w:after="120"/>
+        <w:jc w:val="both"/>
+      </w:pPr>
+      <w:r>
+        <w:rPr>
+          <w:rFonts w:ascii="Times New Roman" w:hAnsi="Times New Roman" w:eastAsia="맑은 고딕"/>
+          <w:b w:val="0"/>
+          <w:i w:val="0"/>
+          <w:sz w:val="22"/>
+        </w:rPr>
+        <w:t>본 연구가 다루는 gme 계열은 원논문에 등량 흡착열 실측치가 보고되어 있지 않다. 따라서 계산된 절대값을 교정할 기준이 필요하다. 문헌에 실측 흡착열이 보고된 ZIF-93(rho 위상, 4-메틸-5-이미다졸카복스알데하이드 링커)을 동일 프로토콜로 계산해 대조했다. 판정 기준(편차 3 kJ/mol 이내면 절대값 신뢰)은 계산 이전에 등록했다.</w:t>
+      </w:r>
+    </w:p>
+    <w:p>
+      <w:pPr>
+        <w:spacing w:line="240" w:lineRule="auto" w:after="40" w:before="80"/>
+      </w:pPr>
+      <w:r>
+        <w:rPr>
+          <w:rFonts w:ascii="Times New Roman" w:hAnsi="Times New Roman" w:eastAsia="맑은 고딕"/>
+          <w:b/>
+          <w:i w:val="0"/>
+          <w:sz w:val="19"/>
+        </w:rPr>
+        <w:t>표 3. 문헌 실측치와의 대조 (kJ/mol, ZIF-93)</w:t>
+      </w:r>
+    </w:p>
+    <w:tbl>
+      <w:tblPr>
+        <w:tblStyle w:val="TableGrid"/>
+        <w:tblW w:type="auto" w:w="0"/>
+        <w:jc w:val="center"/>
+        <w:tblLook w:firstColumn="1" w:firstRow="1" w:lastColumn="0" w:lastRow="0" w:noHBand="0" w:noVBand="1" w:val="04A0"/>
+      </w:tblPr>
+      <w:tblGrid>
+        <w:gridCol w:w="2324"/>
+        <w:gridCol w:w="2324"/>
+        <w:gridCol w:w="2324"/>
+        <w:gridCol w:w="2324"/>
+      </w:tblGrid>
+      <w:tr>
+        <w:tc>
+          <w:tcPr>
+            <w:tcW w:type="dxa" w:w="1928"/>
+          </w:tcPr>
+          <w:p>
+            <w:pPr>
+              <w:spacing w:after="20" w:before="20" w:line="240" w:lineRule="auto"/>
+            </w:pPr>
+            <w:r/>
+            <w:r>
+              <w:rPr>
+                <w:rFonts w:ascii="Times New Roman" w:hAnsi="Times New Roman" w:eastAsia="맑은 고딕"/>
+                <w:b/>
+                <w:i w:val="0"/>
+                <w:sz w:val="19"/>
+              </w:rPr>
+              <w:t>항목</w:t>
+            </w:r>
+          </w:p>
+        </w:tc>
+        <w:tc>
+          <w:tcPr>
+            <w:tcW w:type="dxa" w:w="1928"/>
+          </w:tcPr>
+          <w:p>
+            <w:pPr>
+              <w:spacing w:after="20" w:before="20" w:line="240" w:lineRule="auto"/>
+              <w:jc w:val="center"/>
+            </w:pPr>
+            <w:r/>
+            <w:r>
+              <w:rPr>
+                <w:rFonts w:ascii="Times New Roman" w:hAnsi="Times New Roman" w:eastAsia="맑은 고딕"/>
+                <w:b/>
+                <w:i w:val="0"/>
+                <w:sz w:val="19"/>
+              </w:rPr>
+              <w:t>본 연구</w:t>
+            </w:r>
+          </w:p>
+        </w:tc>
+        <w:tc>
+          <w:tcPr>
+            <w:tcW w:type="dxa" w:w="1701"/>
+          </w:tcPr>
+          <w:p>
+            <w:pPr>
+              <w:spacing w:after="20" w:before="20" w:line="240" w:lineRule="auto"/>
+              <w:jc w:val="center"/>
+            </w:pPr>
+            <w:r/>
+            <w:r>
+              <w:rPr>
+                <w:rFonts w:ascii="Times New Roman" w:hAnsi="Times New Roman" w:eastAsia="맑은 고딕"/>
+                <w:b/>
+                <w:i w:val="0"/>
+                <w:sz w:val="19"/>
+              </w:rPr>
+              <w:t>문헌 실측</w:t>
+            </w:r>
+          </w:p>
+        </w:tc>
+        <w:tc>
+          <w:tcPr>
+            <w:tcW w:type="dxa" w:w="1474"/>
+          </w:tcPr>
+          <w:p>
+            <w:pPr>
+              <w:spacing w:after="20" w:before="20" w:line="240" w:lineRule="auto"/>
+              <w:jc w:val="center"/>
+            </w:pPr>
+            <w:r/>
+            <w:r>
+              <w:rPr>
+                <w:rFonts w:ascii="Times New Roman" w:hAnsi="Times New Roman" w:eastAsia="맑은 고딕"/>
+                <w:b/>
+                <w:i w:val="0"/>
+                <w:sz w:val="19"/>
+              </w:rPr>
+              <w:t>편차</w:t>
+            </w:r>
+          </w:p>
+        </w:tc>
+      </w:tr>
+      <w:tr>
+        <w:tc>
+          <w:tcPr>
+            <w:tcW w:type="dxa" w:w="1928"/>
+          </w:tcPr>
+          <w:p>
+            <w:pPr>
+              <w:spacing w:after="20" w:before="20" w:line="240" w:lineRule="auto"/>
+            </w:pPr>
+            <w:r/>
+            <w:r>
+              <w:rPr>
+                <w:rFonts w:ascii="Times New Roman" w:hAnsi="Times New Roman" w:eastAsia="맑은 고딕"/>
+                <w:b w:val="0"/>
+                <w:i w:val="0"/>
+                <w:sz w:val="19"/>
+              </w:rPr>
+              <w:t>Q_st (CO₂)</w:t>
+            </w:r>
+          </w:p>
+        </w:tc>
+        <w:tc>
+          <w:tcPr>
+            <w:tcW w:type="dxa" w:w="1928"/>
+          </w:tcPr>
+          <w:p>
+            <w:pPr>
+              <w:spacing w:after="20" w:before="20" w:line="240" w:lineRule="auto"/>
+              <w:jc w:val="center"/>
+            </w:pPr>
+            <w:r/>
+            <w:r>
+              <w:rPr>
+                <w:rFonts w:ascii="Times New Roman" w:hAnsi="Times New Roman" w:eastAsia="맑은 고딕"/>
+                <w:b w:val="0"/>
+                <w:i w:val="0"/>
+                <w:sz w:val="19"/>
+              </w:rPr>
+              <w:t>30.25 ± 0.41</w:t>
+            </w:r>
+          </w:p>
+        </w:tc>
+        <w:tc>
+          <w:tcPr>
+            <w:tcW w:type="dxa" w:w="1701"/>
+          </w:tcPr>
+          <w:p>
+            <w:pPr>
+              <w:spacing w:after="20" w:before="20" w:line="240" w:lineRule="auto"/>
+              <w:jc w:val="center"/>
+            </w:pPr>
+            <w:r/>
+            <w:r>
+              <w:rPr>
+                <w:rFonts w:ascii="Times New Roman" w:hAnsi="Times New Roman" w:eastAsia="맑은 고딕"/>
+                <w:b w:val="0"/>
+                <w:i w:val="0"/>
+                <w:sz w:val="19"/>
+              </w:rPr>
+              <w:t>29.3</w:t>
+            </w:r>
+          </w:p>
+        </w:tc>
+        <w:tc>
+          <w:tcPr>
+            <w:tcW w:type="dxa" w:w="1474"/>
+          </w:tcPr>
+          <w:p>
+            <w:pPr>
+              <w:spacing w:after="20" w:before="20" w:line="240" w:lineRule="auto"/>
+              <w:jc w:val="center"/>
+            </w:pPr>
+            <w:r/>
+            <w:r>
+              <w:rPr>
+                <w:rFonts w:ascii="Times New Roman" w:hAnsi="Times New Roman" w:eastAsia="맑은 고딕"/>
+                <w:b w:val="0"/>
+                <w:i w:val="0"/>
+                <w:sz w:val="19"/>
+              </w:rPr>
+              <w:t>+0.95</w:t>
+            </w:r>
+          </w:p>
+        </w:tc>
+      </w:tr>
+      <w:tr>
+        <w:tc>
+          <w:tcPr>
+            <w:tcW w:type="dxa" w:w="1928"/>
+          </w:tcPr>
+          <w:p>
+            <w:pPr>
+              <w:spacing w:after="20" w:before="20" w:line="240" w:lineRule="auto"/>
+            </w:pPr>
+            <w:r/>
+            <w:r>
+              <w:rPr>
+                <w:rFonts w:ascii="Times New Roman" w:hAnsi="Times New Roman" w:eastAsia="맑은 고딕"/>
+                <w:b w:val="0"/>
+                <w:i w:val="0"/>
+                <w:sz w:val="19"/>
+              </w:rPr>
+              <w:t>Q_st (N₂)</w:t>
+            </w:r>
+          </w:p>
+        </w:tc>
+        <w:tc>
+          <w:tcPr>
+            <w:tcW w:type="dxa" w:w="1928"/>
+          </w:tcPr>
+          <w:p>
+            <w:pPr>
+              <w:spacing w:after="20" w:before="20" w:line="240" w:lineRule="auto"/>
+              <w:jc w:val="center"/>
+            </w:pPr>
+            <w:r/>
+            <w:r>
+              <w:rPr>
+                <w:rFonts w:ascii="Times New Roman" w:hAnsi="Times New Roman" w:eastAsia="맑은 고딕"/>
+                <w:b w:val="0"/>
+                <w:i w:val="0"/>
+                <w:sz w:val="19"/>
+              </w:rPr>
+              <w:t>15.86 ± 0.08</w:t>
+            </w:r>
+          </w:p>
+        </w:tc>
+        <w:tc>
+          <w:tcPr>
+            <w:tcW w:type="dxa" w:w="1701"/>
+          </w:tcPr>
+          <w:p>
+            <w:pPr>
+              <w:spacing w:after="20" w:before="20" w:line="240" w:lineRule="auto"/>
+              <w:jc w:val="center"/>
+            </w:pPr>
+            <w:r/>
+            <w:r>
+              <w:rPr>
+                <w:rFonts w:ascii="Times New Roman" w:hAnsi="Times New Roman" w:eastAsia="맑은 고딕"/>
+                <w:b w:val="0"/>
+                <w:i w:val="0"/>
+                <w:sz w:val="19"/>
+              </w:rPr>
+              <w:t>15.71</w:t>
+            </w:r>
+          </w:p>
+        </w:tc>
+        <w:tc>
+          <w:tcPr>
+            <w:tcW w:type="dxa" w:w="1474"/>
+          </w:tcPr>
+          <w:p>
+            <w:pPr>
+              <w:spacing w:after="20" w:before="20" w:line="240" w:lineRule="auto"/>
+              <w:jc w:val="center"/>
+            </w:pPr>
+            <w:r/>
+            <w:r>
+              <w:rPr>
+                <w:rFonts w:ascii="Times New Roman" w:hAnsi="Times New Roman" w:eastAsia="맑은 고딕"/>
+                <w:b w:val="0"/>
+                <w:i w:val="0"/>
+                <w:sz w:val="19"/>
+              </w:rPr>
+              <w:t>+0.15</w:t>
+            </w:r>
+          </w:p>
+        </w:tc>
+      </w:tr>
+    </w:tbl>
+    <w:p>
+      <w:pPr>
+        <w:spacing w:line="240" w:lineRule="auto" w:after="40" w:before="0"/>
+      </w:pPr>
+    </w:p>
+    <w:p>
+      <w:pPr>
+        <w:spacing w:line="240" w:lineRule="auto" w:after="120"/>
+        <w:jc w:val="both"/>
+      </w:pPr>
+      <w:r>
+        <w:rPr>
+          <w:rFonts w:ascii="Times New Roman" w:hAnsi="Times New Roman" w:eastAsia="맑은 고딕"/>
+          <w:b w:val="0"/>
+          <w:i w:val="0"/>
+          <w:sz w:val="22"/>
+        </w:rPr>
+        <w:t xml:space="preserve">두 기체 모두 1 kJ/mol 이내로 일치하며 사전 등록 기준을 통과한다. 다만 편차가 양수이므로 </w:t>
+      </w:r>
+      <w:r>
+        <w:rPr>
+          <w:rFonts w:ascii="Times New Roman" w:hAnsi="Times New Roman" w:eastAsia="맑은 고딕"/>
+          <w:b/>
+          <w:i w:val="0"/>
+          <w:sz w:val="22"/>
+        </w:rPr>
+        <w:t>본 연구의 흡착열은 약 1 kJ/mol 과대평가되는 방향</w:t>
+      </w:r>
+      <w:r>
+        <w:rPr>
+          <w:rFonts w:ascii="Times New Roman" w:hAnsi="Times New Roman" w:eastAsia="맑은 고딕"/>
+          <w:b w:val="0"/>
+          <w:i w:val="0"/>
+          <w:sz w:val="22"/>
+        </w:rPr>
+        <w:t>이다. 따라서 목표대 문턱 부근의 조성은 실제로 문턱에 더 가깝거나 아래일 수 있으며, 문턱 근처의 판정은 이 여유를 감안해 읽어야 한다. 또한 문헌값은 본 계산의 통계 오차 범위 밖이므로(2.3σ) 이는 오차 내 일치가 아니라 계통 편차가 작다는 뜻이다. 두 값의 정의도 완전히 같지 않다 — 문헌은 가변온도 등온선 피팅값이고 본 연구는 무한 희석 극한값이다.</w:t>
+      </w:r>
+    </w:p>
+    <w:p>
+      <w:pPr>
+        <w:spacing w:line="240" w:lineRule="auto" w:after="120" w:before="0"/>
+        <w:ind w:left="227"/>
+      </w:pPr>
+      <w:r>
+        <w:rPr>
+          <w:rFonts w:ascii="Times New Roman" w:hAnsi="Times New Roman" w:eastAsia="맑은 고딕"/>
+          <w:b w:val="0"/>
+          <w:i w:val="0"/>
+          <w:sz w:val="19"/>
+        </w:rPr>
+        <w:t>이 대조로 검증된 것은 흡착열의 절대값이며 선택도는 검증 대상이 아니다. 본 연구의 선택도는 0.15 bar 혼합 조건에서, 문헌의 대응값은 IAST 계산에서 얻은 것이어서 정의가 다르다. 한편 같은 조건(0.15 bar, 298 K)에서 ZIF-93의 흡착량은 0.4238 ± 0.0192 mol/kg으로, 본 연구의 무치환 모체(0.5889)보다 낮다.</w:t>
+      </w:r>
+    </w:p>
+    <w:p>
+      <w:pPr>
         <w:spacing w:line="240" w:lineRule="auto" w:after="100" w:before="200"/>
       </w:pPr>
       <w:r>
@@ -1260,7 +1625,7 @@
           <w:i w:val="0"/>
           <w:sz w:val="19"/>
         </w:rPr>
-        <w:t>표 3. 건조 조건 흡착 물성 (298 K, 0.15 bar, 1σ 병기)</w:t>
+        <w:t>표 4. 건조 조건 흡착 물성 (298 K, 0.15 bar, 1σ 병기)</w:t>
       </w:r>
     </w:p>
     <w:tbl>
@@ -2043,7 +2408,7 @@
           <w:i w:val="0"/>
           <w:sz w:val="19"/>
         </w:rPr>
-        <w:t>표 4. 수분 경쟁 (298 K, CO₂ 0.15 bar 고정, RH 0~90%, 1σ 병기)</w:t>
+        <w:t>표 5. 수분 경쟁 (298 K, CO₂ 0.15 bar 고정, RH 0~90%, 1σ 병기)</w:t>
       </w:r>
     </w:p>
     <w:tbl>
@@ -2978,7 +3343,7 @@
           <w:i w:val="0"/>
           <w:sz w:val="19"/>
         </w:rPr>
-        <w:t>표 5. 습윤 작업 용량 (mol/kg, 1σ 병기). 작업 용량의 오차는 두 로딩 오차의 제곱합근이다.</w:t>
+        <w:t>표 6. 습윤 작업 용량 (mol/kg, 1σ 병기). 작업 용량의 오차는 두 로딩 오차의 제곱합근이다.</w:t>
       </w:r>
     </w:p>
     <w:tbl>
@@ -3831,7 +4196,7 @@
           <w:i w:val="0"/>
           <w:sz w:val="19"/>
         </w:rPr>
-        <w:t>표 6. TSA 재생 에너지 수지 (Cp 0.9 J/g·K, 열회수 0%, 회수율 50%)</w:t>
+        <w:t>표 7. TSA 재생 에너지 수지 (Cp 0.9 J/g·K, 열회수 0%, 회수율 50%)</w:t>
       </w:r>
     </w:p>
     <w:tbl>
@@ -4717,7 +5082,7 @@
           <w:i w:val="0"/>
           <w:sz w:val="19"/>
         </w:rPr>
-        <w:t>표 7. 구조 안정성 관문 결과 (전체 31종 중 28종 통과)</w:t>
+        <w:t>표 8. 구조 안정성 관문 결과 (전체 31종 중 28종 통과)</w:t>
       </w:r>
     </w:p>
     <w:tbl>
@@ -5352,7 +5717,7 @@
           <w:i w:val="0"/>
           <w:sz w:val="19"/>
         </w:rPr>
-        <w:t>표 8. 조성 격자 — 두 문턱의 위치 (치환 자리 24개, 한 칸 4.17%p)</w:t>
+        <w:t>표 9. 조성 격자 — 두 문턱의 위치 (치환 자리 24개, 한 칸 4.17%p)</w:t>
       </w:r>
     </w:p>
     <w:tbl>
@@ -6196,7 +6561,7 @@
           <w:i w:val="0"/>
           <w:sz w:val="19"/>
         </w:rPr>
-        <w:t>표 9. 두 관문을 통과한 조성의 완전 비교 (mol/kg, 1σ 병기)</w:t>
+        <w:t>표 10. 두 관문을 통과한 조성의 완전 비교 (mol/kg, 1σ 병기)</w:t>
       </w:r>
     </w:p>
     <w:tbl>
@@ -6961,7 +7326,7 @@
           <w:i w:val="0"/>
           <w:sz w:val="19"/>
         </w:rPr>
-        <w:t>표 10. 혼합 치환 조성 — 건조 성능, 구조 안정성, 습윤 작업 용량</w:t>
+        <w:t>표 11. 혼합 치환 조성 — 건조 성능, 구조 안정성, 습윤 작업 용량</w:t>
       </w:r>
     </w:p>
     <w:tbl>

</xml_diff>